<commit_message>
chore(global): staging pre-1.0 state
</commit_message>
<xml_diff>
--- a/src/main/resources/template.docx
+++ b/src/main/resources/template.docx
@@ -387,7 +387,7 @@
       <w:pPr>
         <w:pStyle w:val="Normal"/>
         <w:spacing w:lineRule="auto" w:line="360"/>
-        <w:ind w:left="6237" w:hanging="0"/>
+        <w:ind w:hanging="0"/>
         <w:jc w:val="right"/>
         <w:rPr>
           <w:sz w:val="28"/>
@@ -564,24 +564,24 @@
           <w:sz w:val="28"/>
           <w:szCs w:val="28"/>
         </w:rPr>
+      </w:r>
+    </w:p>
+    <w:p>
+      <w:pPr>
+        <w:pStyle w:val="Normal"/>
+        <w:spacing w:lineRule="auto" w:line="360"/>
+        <w:jc w:val="center"/>
+        <w:rPr>
+          <w:sz w:val="28"/>
+          <w:szCs w:val="28"/>
+        </w:rPr>
+      </w:pPr>
+      <w:r>
+        <w:rPr>
+          <w:sz w:val="28"/>
+          <w:szCs w:val="28"/>
+        </w:rPr>
         <w:t>Львів - ${year}</w:t>
-      </w:r>
-    </w:p>
-    <w:p>
-      <w:pPr>
-        <w:pStyle w:val="Normal"/>
-        <w:spacing w:lineRule="auto" w:line="360"/>
-        <w:jc w:val="left"/>
-        <w:rPr>
-          <w:sz w:val="28"/>
-          <w:szCs w:val="28"/>
-        </w:rPr>
-      </w:pPr>
-      <w:r>
-        <w:rPr>
-          <w:sz w:val="28"/>
-          <w:szCs w:val="28"/>
-        </w:rPr>
       </w:r>
     </w:p>
     <w:p>
@@ -622,7 +622,6 @@
       </w:pPr>
       <w:r>
         <w:rPr>
-          <w:rFonts w:ascii="Times New Roman" w:hAnsi="Times New Roman"/>
           <w:sz w:val="24"/>
           <w:szCs w:val="24"/>
         </w:rPr>
@@ -719,7 +718,6 @@
       </w:pPr>
       <w:r>
         <w:rPr>
-          <w:rFonts w:ascii="Times New Roman" w:hAnsi="Times New Roman"/>
           <w:sz w:val="24"/>
           <w:szCs w:val="24"/>
         </w:rPr>
@@ -728,53 +726,137 @@
     </w:p>
     <w:p>
       <w:pPr>
-        <w:pStyle w:val="Normal"/>
+        <w:pStyle w:val="2"/>
+        <w:numPr>
+          <w:ilvl w:val="1"/>
+          <w:numId w:val="1"/>
+        </w:numPr>
         <w:jc w:val="center"/>
-        <w:rPr>
-          <w:b/>
-          <w:bCs/>
-          <w:sz w:val="28"/>
-          <w:szCs w:val="28"/>
+        <w:rPr/>
+      </w:pPr>
+      <w:r>
+        <w:rPr>
+          <w:rFonts w:ascii="Times New Roman" w:hAnsi="Times New Roman"/>
+          <w:sz w:val="28"/>
+          <w:szCs w:val="28"/>
+        </w:rPr>
+        <w:t>#if(!$codeMap.isEmpty())Код програми</w:t>
+      </w:r>
+    </w:p>
+    <w:p>
+      <w:pPr>
+        <w:pStyle w:val="Style15"/>
+        <w:jc w:val="center"/>
+        <w:rPr>
+          <w:rFonts w:ascii="Times New Roman" w:hAnsi="Times New Roman"/>
+          <w:sz w:val="28"/>
+          <w:szCs w:val="28"/>
+        </w:rPr>
+      </w:pPr>
+      <w:r>
+        <w:rPr>
           <w:lang w:eastAsia="ja-JP"/>
         </w:rPr>
-      </w:pPr>
-      <w:r>
-        <w:rPr>
-          <w:b/>
-          <w:bCs/>
-          <w:sz w:val="28"/>
-          <w:szCs w:val="28"/>
+      </w:r>
+    </w:p>
+    <w:p>
+      <w:pPr>
+        <w:pStyle w:val="Normal"/>
+        <w:rPr>
           <w:lang w:eastAsia="ja-JP"/>
         </w:rPr>
-        <w:t>#if($code)Код програми</w:t>
-      </w:r>
-    </w:p>
-    <w:p>
-      <w:pPr>
-        <w:pStyle w:val="Normal"/>
+      </w:pPr>
+      <w:r>
         <w:rPr>
           <w:lang w:eastAsia="ja-JP"/>
         </w:rPr>
-      </w:pPr>
-      <w:r>
+        <w:t>#foreach($entry in $codeMap.entrySet())</w:t>
+      </w:r>
+    </w:p>
+    <w:p>
+      <w:pPr>
+        <w:pStyle w:val="2"/>
+        <w:numPr>
+          <w:ilvl w:val="1"/>
+          <w:numId w:val="1"/>
+        </w:numPr>
+        <w:jc w:val="center"/>
+        <w:rPr>
+          <w:sz w:val="18"/>
+          <w:szCs w:val="18"/>
+        </w:rPr>
+      </w:pPr>
+      <w:r>
+        <w:rPr>
+          <w:rFonts w:ascii="JetBrains Mono" w:hAnsi="JetBrains Mono"/>
+          <w:sz w:val="18"/>
+          <w:szCs w:val="18"/>
+        </w:rPr>
+        <w:t>${entry.key}</w:t>
+      </w:r>
+    </w:p>
+    <w:p>
+      <w:pPr>
+        <w:pStyle w:val="Normal"/>
+        <w:rPr>
+          <w:rFonts w:ascii="JetBrains Mono" w:hAnsi="JetBrains Mono"/>
+          <w:sz w:val="14"/>
+          <w:szCs w:val="14"/>
+        </w:rPr>
+      </w:pPr>
+      <w:r>
+        <w:rPr>
+          <w:rFonts w:ascii="JetBrains Mono" w:hAnsi="JetBrains Mono"/>
+          <w:sz w:val="14"/>
+          <w:szCs w:val="14"/>
+        </w:rPr>
+      </w:r>
+    </w:p>
+    <w:p>
+      <w:pPr>
+        <w:pStyle w:val="Normal"/>
+        <w:rPr>
+          <w:rFonts w:ascii="JetBrains Mono" w:hAnsi="JetBrains Mono"/>
+          <w:sz w:val="14"/>
+          <w:szCs w:val="14"/>
+        </w:rPr>
+      </w:pPr>
+      <w:r>
+        <w:rPr>
+          <w:rFonts w:ascii="JetBrains Mono" w:hAnsi="JetBrains Mono"/>
+          <w:sz w:val="14"/>
+          <w:szCs w:val="14"/>
+        </w:rPr>
+        <w:t>${entry.value}</w:t>
+      </w:r>
+    </w:p>
+    <w:p>
+      <w:pPr>
+        <w:pStyle w:val="Normal"/>
+        <w:rPr>
+          <w:rFonts w:ascii="JetBrains Mono" w:hAnsi="JetBrains Mono"/>
+          <w:sz w:val="14"/>
+          <w:szCs w:val="14"/>
+        </w:rPr>
+      </w:pPr>
+      <w:r>
+        <w:rPr>
+          <w:rFonts w:ascii="JetBrains Mono" w:hAnsi="JetBrains Mono"/>
+          <w:sz w:val="14"/>
+          <w:szCs w:val="14"/>
+        </w:rPr>
+      </w:r>
+    </w:p>
+    <w:p>
+      <w:pPr>
+        <w:pStyle w:val="Normal"/>
         <w:rPr>
           <w:lang w:eastAsia="ja-JP"/>
         </w:rPr>
-        <w:t>${code}</w:t>
-      </w:r>
-    </w:p>
-    <w:p>
-      <w:pPr>
-        <w:pStyle w:val="Normal"/>
-        <w:rPr>
-          <w:lang w:eastAsia="ja-JP"/>
-        </w:rPr>
-      </w:pPr>
-      <w:r>
-        <w:rPr>
-          <w:lang w:eastAsia="ja-JP"/>
-        </w:rPr>
-        <w:t>#end</w:t>
+      </w:pPr>
+      <w:r>
+        <w:rPr/>
+        <w:t>#end#end</w:t>
       </w:r>
     </w:p>
     <w:sectPr>
@@ -805,20 +887,21 @@
         </w:tabs>
         <w:ind w:left="0" w:hanging="0"/>
       </w:pPr>
+      <w:rPr/>
     </w:lvl>
     <w:lvl w:ilvl="1">
       <w:start w:val="1"/>
-      <w:pStyle w:val="2"/>
-      <w:numFmt w:val="none"/>
-      <w:suff w:val="nothing"/>
-      <w:lvlText w:val=""/>
-      <w:lvlJc w:val="left"/>
-      <w:pPr>
-        <w:tabs>
-          <w:tab w:val="num" w:pos="0"/>
-        </w:tabs>
-        <w:ind w:left="0" w:hanging="0"/>
-      </w:pPr>
+      <w:numFmt w:val="none"/>
+      <w:suff w:val="nothing"/>
+      <w:lvlText w:val=""/>
+      <w:lvlJc w:val="left"/>
+      <w:pPr>
+        <w:tabs>
+          <w:tab w:val="num" w:pos="0"/>
+        </w:tabs>
+        <w:ind w:left="0" w:hanging="0"/>
+      </w:pPr>
+      <w:rPr/>
     </w:lvl>
     <w:lvl w:ilvl="2">
       <w:start w:val="1"/>
@@ -832,6 +915,7 @@
         </w:tabs>
         <w:ind w:left="0" w:hanging="0"/>
       </w:pPr>
+      <w:rPr/>
     </w:lvl>
     <w:lvl w:ilvl="3">
       <w:start w:val="1"/>
@@ -845,6 +929,7 @@
         </w:tabs>
         <w:ind w:left="0" w:hanging="0"/>
       </w:pPr>
+      <w:rPr/>
     </w:lvl>
     <w:lvl w:ilvl="4">
       <w:start w:val="1"/>
@@ -858,6 +943,7 @@
         </w:tabs>
         <w:ind w:left="0" w:hanging="0"/>
       </w:pPr>
+      <w:rPr/>
     </w:lvl>
     <w:lvl w:ilvl="5">
       <w:start w:val="1"/>
@@ -871,6 +957,7 @@
         </w:tabs>
         <w:ind w:left="0" w:hanging="0"/>
       </w:pPr>
+      <w:rPr/>
     </w:lvl>
     <w:lvl w:ilvl="6">
       <w:start w:val="1"/>
@@ -884,6 +971,7 @@
         </w:tabs>
         <w:ind w:left="0" w:hanging="0"/>
       </w:pPr>
+      <w:rPr/>
     </w:lvl>
     <w:lvl w:ilvl="7">
       <w:start w:val="1"/>
@@ -897,6 +985,7 @@
         </w:tabs>
         <w:ind w:left="0" w:hanging="0"/>
       </w:pPr>
+      <w:rPr/>
     </w:lvl>
     <w:lvl w:ilvl="8">
       <w:start w:val="1"/>
@@ -910,6 +999,7 @@
         </w:tabs>
         <w:ind w:left="0" w:hanging="0"/>
       </w:pPr>
+      <w:rPr/>
     </w:lvl>
   </w:abstractNum>
   <w:abstractNum w:abstractNumId="2">
@@ -1038,6 +1128,125 @@
         <w:ind w:left="0" w:hanging="0"/>
       </w:pPr>
       <w:rPr/>
+    </w:lvl>
+  </w:abstractNum>
+  <w:abstractNum w:abstractNumId="3">
+    <w:lvl w:ilvl="0">
+      <w:start w:val="1"/>
+      <w:numFmt w:val="none"/>
+      <w:suff w:val="nothing"/>
+      <w:lvlText w:val=""/>
+      <w:lvlJc w:val="left"/>
+      <w:pPr>
+        <w:tabs>
+          <w:tab w:val="num" w:pos="0"/>
+        </w:tabs>
+        <w:ind w:left="0" w:hanging="0"/>
+      </w:pPr>
+    </w:lvl>
+    <w:lvl w:ilvl="1">
+      <w:start w:val="1"/>
+      <w:numFmt w:val="none"/>
+      <w:suff w:val="nothing"/>
+      <w:lvlText w:val=""/>
+      <w:lvlJc w:val="left"/>
+      <w:pPr>
+        <w:tabs>
+          <w:tab w:val="num" w:pos="0"/>
+        </w:tabs>
+        <w:ind w:left="0" w:hanging="0"/>
+      </w:pPr>
+    </w:lvl>
+    <w:lvl w:ilvl="2">
+      <w:start w:val="1"/>
+      <w:numFmt w:val="none"/>
+      <w:suff w:val="nothing"/>
+      <w:lvlText w:val=""/>
+      <w:lvlJc w:val="left"/>
+      <w:pPr>
+        <w:tabs>
+          <w:tab w:val="num" w:pos="0"/>
+        </w:tabs>
+        <w:ind w:left="0" w:hanging="0"/>
+      </w:pPr>
+    </w:lvl>
+    <w:lvl w:ilvl="3">
+      <w:start w:val="1"/>
+      <w:numFmt w:val="none"/>
+      <w:suff w:val="nothing"/>
+      <w:lvlText w:val=""/>
+      <w:lvlJc w:val="left"/>
+      <w:pPr>
+        <w:tabs>
+          <w:tab w:val="num" w:pos="0"/>
+        </w:tabs>
+        <w:ind w:left="0" w:hanging="0"/>
+      </w:pPr>
+    </w:lvl>
+    <w:lvl w:ilvl="4">
+      <w:start w:val="1"/>
+      <w:numFmt w:val="none"/>
+      <w:suff w:val="nothing"/>
+      <w:lvlText w:val=""/>
+      <w:lvlJc w:val="left"/>
+      <w:pPr>
+        <w:tabs>
+          <w:tab w:val="num" w:pos="0"/>
+        </w:tabs>
+        <w:ind w:left="0" w:hanging="0"/>
+      </w:pPr>
+    </w:lvl>
+    <w:lvl w:ilvl="5">
+      <w:start w:val="1"/>
+      <w:numFmt w:val="none"/>
+      <w:suff w:val="nothing"/>
+      <w:lvlText w:val=""/>
+      <w:lvlJc w:val="left"/>
+      <w:pPr>
+        <w:tabs>
+          <w:tab w:val="num" w:pos="0"/>
+        </w:tabs>
+        <w:ind w:left="0" w:hanging="0"/>
+      </w:pPr>
+    </w:lvl>
+    <w:lvl w:ilvl="6">
+      <w:start w:val="1"/>
+      <w:numFmt w:val="none"/>
+      <w:suff w:val="nothing"/>
+      <w:lvlText w:val=""/>
+      <w:lvlJc w:val="left"/>
+      <w:pPr>
+        <w:tabs>
+          <w:tab w:val="num" w:pos="0"/>
+        </w:tabs>
+        <w:ind w:left="0" w:hanging="0"/>
+      </w:pPr>
+    </w:lvl>
+    <w:lvl w:ilvl="7">
+      <w:start w:val="1"/>
+      <w:numFmt w:val="none"/>
+      <w:suff w:val="nothing"/>
+      <w:lvlText w:val=""/>
+      <w:lvlJc w:val="left"/>
+      <w:pPr>
+        <w:tabs>
+          <w:tab w:val="num" w:pos="0"/>
+        </w:tabs>
+        <w:ind w:left="0" w:hanging="0"/>
+      </w:pPr>
+    </w:lvl>
+    <w:lvl w:ilvl="8">
+      <w:start w:val="1"/>
+      <w:numFmt w:val="none"/>
+      <w:suff w:val="nothing"/>
+      <w:lvlText w:val=""/>
+      <w:lvlJc w:val="left"/>
+      <w:pPr>
+        <w:tabs>
+          <w:tab w:val="num" w:pos="0"/>
+        </w:tabs>
+        <w:ind w:left="0" w:hanging="0"/>
+      </w:pPr>
     </w:lvl>
   </w:abstractNum>
   <w:num w:numId="1">
@@ -1045,6 +1254,9 @@
   </w:num>
   <w:num w:numId="2">
     <w:abstractNumId w:val="2"/>
+  </w:num>
+  <w:num w:numId="3">
+    <w:abstractNumId w:val="3"/>
   </w:num>
 </w:numbering>
 </file>

</xml_diff>